<commit_message>
Update Merkblatt für zentrale Prüfungsadministration
</commit_message>
<xml_diff>
--- a/Merkblätter/Merkblatt Prüfungsadministration/Merkblatt für zentrale Prüfungsadministration.docx
+++ b/Merkblätter/Merkblatt Prüfungsadministration/Merkblatt für zentrale Prüfungsadministration.docx
@@ -47,7 +47,7 @@
           <w:i/>
           <w:iCs/>
         </w:rPr>
-        <w:t>09</w:t>
+        <w:t>10</w:t>
       </w:r>
     </w:p>
     <w:p>
@@ -98,7 +98,21 @@
         <w:rPr>
           <w:lang w:bidi="th-TH"/>
         </w:rPr>
-        <w:t>Sie muss Mitglied im zuständigen Knowledge Badge-Orgateam sein</w:t>
+        <w:t>Sie muss Mitglied im zuständigen Knowledge Badge-</w:t>
+      </w:r>
+      <w:proofErr w:type="spellStart"/>
+      <w:r>
+        <w:rPr>
+          <w:lang w:bidi="th-TH"/>
+        </w:rPr>
+        <w:t>Orgateam</w:t>
+      </w:r>
+      <w:proofErr w:type="spellEnd"/>
+      <w:r>
+        <w:rPr>
+          <w:lang w:bidi="th-TH"/>
+        </w:rPr>
+        <w:t xml:space="preserve"> sein</w:t>
       </w:r>
     </w:p>
     <w:p>
@@ -146,7 +160,21 @@
         <w:rPr>
           <w:lang w:bidi="th-TH"/>
         </w:rPr>
-        <w:t xml:space="preserve">Das Orgateam wählt die </w:t>
+        <w:t xml:space="preserve">Das </w:t>
+      </w:r>
+      <w:proofErr w:type="spellStart"/>
+      <w:r>
+        <w:rPr>
+          <w:lang w:bidi="th-TH"/>
+        </w:rPr>
+        <w:t>Orgateam</w:t>
+      </w:r>
+      <w:proofErr w:type="spellEnd"/>
+      <w:r>
+        <w:rPr>
+          <w:lang w:bidi="th-TH"/>
+        </w:rPr>
+        <w:t xml:space="preserve"> wählt die </w:t>
       </w:r>
       <w:r>
         <w:rPr>
@@ -196,7 +224,25 @@
           <w:iCs/>
           <w:lang w:bidi="th-TH"/>
         </w:rPr>
-        <w:t>Verwaltung des Examenskurs in Moodle“</w:t>
+        <w:t xml:space="preserve">Verwaltung des Examenskurs in </w:t>
+      </w:r>
+      <w:proofErr w:type="spellStart"/>
+      <w:r>
+        <w:rPr>
+          <w:i/>
+          <w:iCs/>
+          <w:lang w:bidi="th-TH"/>
+        </w:rPr>
+        <w:t>Moodle</w:t>
+      </w:r>
+      <w:proofErr w:type="spellEnd"/>
+      <w:r>
+        <w:rPr>
+          <w:i/>
+          <w:iCs/>
+          <w:lang w:bidi="th-TH"/>
+        </w:rPr>
+        <w:t>“</w:t>
       </w:r>
       <w:r>
         <w:rPr>
@@ -693,7 +739,21 @@
         <w:rPr>
           <w:lang w:bidi="th-TH"/>
         </w:rPr>
-        <w:t>Alle Aufsichtspersonen müssen sich vorab auf der Moodle-Plattform registrieren</w:t>
+        <w:t xml:space="preserve">Alle Aufsichtspersonen müssen sich vorab auf der </w:t>
+      </w:r>
+      <w:proofErr w:type="spellStart"/>
+      <w:r>
+        <w:rPr>
+          <w:lang w:bidi="th-TH"/>
+        </w:rPr>
+        <w:t>Moodle</w:t>
+      </w:r>
+      <w:proofErr w:type="spellEnd"/>
+      <w:r>
+        <w:rPr>
+          <w:lang w:bidi="th-TH"/>
+        </w:rPr>
+        <w:t>-Plattform registrieren</w:t>
       </w:r>
     </w:p>
     <w:p>
@@ -832,7 +892,63 @@
         <w:rPr>
           <w:lang w:bidi="th-TH"/>
         </w:rPr>
-        <w:t>Händisch Anmelde-Bestätigungsmail an die Prüflinge versenden (aktuell nicht automatisch möglich)</w:t>
+        <w:t>Händisch Anmelde</w:t>
+      </w:r>
+      <w:r>
+        <w:rPr>
+          <w:lang w:bidi="th-TH"/>
+        </w:rPr>
+        <w:t>b</w:t>
+      </w:r>
+      <w:r>
+        <w:rPr>
+          <w:lang w:bidi="th-TH"/>
+        </w:rPr>
+        <w:t xml:space="preserve">estätigung </w:t>
+      </w:r>
+      <w:r>
+        <w:rPr>
+          <w:lang w:bidi="th-TH"/>
+        </w:rPr>
+        <w:t xml:space="preserve">per Mail </w:t>
+      </w:r>
+      <w:r>
+        <w:rPr>
+          <w:lang w:bidi="th-TH"/>
+        </w:rPr>
+        <w:t>an die Prüflinge versenden (aktuell nicht automatisch möglich</w:t>
+      </w:r>
+      <w:r>
+        <w:rPr>
+          <w:lang w:bidi="th-TH"/>
+        </w:rPr>
+        <w:t xml:space="preserve">; </w:t>
+      </w:r>
+      <w:r>
+        <w:rPr>
+          <w:lang w:bidi="th-TH"/>
+        </w:rPr>
+        <w:t xml:space="preserve">siehe </w:t>
+      </w:r>
+      <w:r>
+        <w:rPr>
+          <w:lang w:bidi="th-TH"/>
+        </w:rPr>
+        <w:t xml:space="preserve">Mailvorlage im GitHub-Ordner </w:t>
+      </w:r>
+      <w:r>
+        <w:rPr>
+          <w:i/>
+          <w:iCs/>
+          <w:lang w:bidi="th-TH"/>
+        </w:rPr>
+        <w:t>Vorlagen</w:t>
+      </w:r>
+      <w:r>
+        <w:rPr>
+          <w:lang w:bidi="th-TH"/>
+        </w:rPr>
+        <w:t>)</w:t>
       </w:r>
     </w:p>
     <w:p>
@@ -1056,24 +1172,101 @@
           <w:b/>
           <w:bCs/>
         </w:rPr>
-        <w:t xml:space="preserve">Einladungs-Email an die Prüflinge versenden </w:t>
+        <w:t>Einladung</w:t>
       </w:r>
       <w:r>
         <w:rPr>
           <w:b/>
           <w:bCs/>
         </w:rPr>
-        <w:t>(ca. 1 Woche vor Anmeldeschluss der jeweiligen Prüfung)</w:t>
-      </w:r>
-      <w:r>
-        <w:t xml:space="preserve"> </w:t>
+        <w:t>s</w:t>
       </w:r>
       <w:r>
         <w:rPr>
           <w:b/>
           <w:bCs/>
         </w:rPr>
-        <w:t>mit folgenden Informationen:</w:t>
+        <w:t>mail an die Prüflinge</w:t>
+      </w:r>
+      <w:r>
+        <w:t xml:space="preserve"> </w:t>
+      </w:r>
+      <w:r>
+        <w:rPr>
+          <w:b/>
+          <w:bCs/>
+        </w:rPr>
+        <w:t>mit folgenden Informationen</w:t>
+      </w:r>
+      <w:r>
+        <w:rPr>
+          <w:b/>
+          <w:bCs/>
+        </w:rPr>
+        <w:t xml:space="preserve"> </w:t>
+      </w:r>
+      <w:r>
+        <w:rPr>
+          <w:b/>
+          <w:bCs/>
+        </w:rPr>
+        <w:t xml:space="preserve">versenden </w:t>
+      </w:r>
+      <w:r>
+        <w:rPr>
+          <w:lang w:bidi="th-TH"/>
+        </w:rPr>
+        <w:t>(</w:t>
+      </w:r>
+      <w:r>
+        <w:rPr>
+          <w:lang w:bidi="th-TH"/>
+        </w:rPr>
+        <w:t xml:space="preserve">nach Anmeldeschluss </w:t>
+      </w:r>
+      <w:r>
+        <w:t xml:space="preserve">ca. 1 Woche </w:t>
+      </w:r>
+      <w:r>
+        <w:t xml:space="preserve">vor </w:t>
+      </w:r>
+      <w:r>
+        <w:t>der jeweiligen Prüfung</w:t>
+      </w:r>
+      <w:r>
+        <w:t xml:space="preserve">; </w:t>
+      </w:r>
+      <w:r>
+        <w:rPr>
+          <w:lang w:bidi="th-TH"/>
+        </w:rPr>
+        <w:t xml:space="preserve">siehe Mailvorlage im </w:t>
+      </w:r>
+      <w:r>
+        <w:rPr>
+          <w:lang w:bidi="th-TH"/>
+        </w:rPr>
+        <w:t>GitHub-</w:t>
+      </w:r>
+      <w:r>
+        <w:rPr>
+          <w:lang w:bidi="th-TH"/>
+        </w:rPr>
+        <w:t xml:space="preserve">Ordner </w:t>
+      </w:r>
+      <w:r>
+        <w:rPr>
+          <w:i/>
+          <w:iCs/>
+          <w:lang w:bidi="th-TH"/>
+        </w:rPr>
+        <w:t>Vorlagen</w:t>
+      </w:r>
+      <w:r>
+        <w:rPr>
+          <w:lang w:bidi="th-TH"/>
+        </w:rPr>
+        <w:t>):</w:t>
       </w:r>
     </w:p>
     <w:p>
@@ -1132,7 +1325,21 @@
           <w:i/>
           <w:iCs/>
         </w:rPr>
-        <w:t>Merblatt für Prüflinge</w:t>
+        <w:t>Mer</w:t>
+      </w:r>
+      <w:r>
+        <w:rPr>
+          <w:i/>
+          <w:iCs/>
+        </w:rPr>
+        <w:t>k</w:t>
+      </w:r>
+      <w:r>
+        <w:rPr>
+          <w:i/>
+          <w:iCs/>
+        </w:rPr>
+        <w:t>blatt für Prüflinge</w:t>
       </w:r>
       <w:r>
         <w:t xml:space="preserve"> und </w:t>
@@ -1302,6 +1509,13 @@
         </w:rPr>
         <w:t xml:space="preserve">E-Mail: </w:t>
       </w:r>
+      <w:r>
+        <w:rPr>
+          <w:rFonts w:ascii="Arial" w:eastAsia="Arial" w:hAnsi="Arial" w:cs="Arial"/>
+          <w:highlight w:val="yellow"/>
+        </w:rPr>
+        <w:t>[E-Mail angeben]</w:t>
+      </w:r>
     </w:p>
     <w:p>
       <w:pPr>
@@ -1315,6 +1529,13 @@
           <w:rFonts w:ascii="Arial" w:eastAsia="Arial" w:hAnsi="Arial" w:cs="Arial"/>
         </w:rPr>
         <w:t xml:space="preserve">Telefon: </w:t>
+      </w:r>
+      <w:r>
+        <w:rPr>
+          <w:rFonts w:ascii="Arial" w:eastAsia="Arial" w:hAnsi="Arial" w:cs="Arial"/>
+          <w:highlight w:val="yellow"/>
+        </w:rPr>
+        <w:t>[Telefonnr. angeben]</w:t>
       </w:r>
     </w:p>
     <w:p>

</xml_diff>